<commit_message>
Update ULAS Easy Justice Paper.docx
revised information in user stories and use case full description
</commit_message>
<xml_diff>
--- a/Documentation/ULAS Easy Justice Paper.docx
+++ b/Documentation/ULAS Easy Justice Paper.docx
@@ -4562,23 +4562,7 @@
             <w:rFonts w:ascii="Arial" w:hAnsi="Arial" w:cs="Arial"/>
             <w:noProof/>
           </w:rPr>
-          <w:t>Figure 1: Use Case Diagr</w:t>
-        </w:r>
-        <w:r>
-          <w:rPr>
-            <w:rStyle w:val="Hyperlink"/>
-            <w:rFonts w:ascii="Arial" w:hAnsi="Arial" w:cs="Arial"/>
-            <w:noProof/>
-          </w:rPr>
-          <w:t>a</w:t>
-        </w:r>
-        <w:r>
-          <w:rPr>
-            <w:rStyle w:val="Hyperlink"/>
-            <w:rFonts w:ascii="Arial" w:hAnsi="Arial" w:cs="Arial"/>
-            <w:noProof/>
-          </w:rPr>
-          <w:t>m</w:t>
+          <w:t>Figure 1: Use Case Diagram</w:t>
         </w:r>
         <w:r>
           <w:rPr>
@@ -12340,6 +12324,22 @@
         </w:rPr>
         <w:t xml:space="preserve">Based on the ULAS Manual and Supreme Court announcements, the ULAS Portal is planned as an online portal under the Judiciary’s website (https://portal.judiciary.gov.ph) that will serve as the official compliance and reporting system for the ULAS program, administered by the Unified Legal Aid Service Office (ULASO). As </w:t>
       </w:r>
+      <w:r>
+        <w:rPr>
+          <w:rFonts w:ascii="Arial" w:hAnsi="Arial" w:cs="Arial"/>
+          <w:sz w:val="24"/>
+          <w:szCs w:val="24"/>
+        </w:rPr>
+        <w:t>for</w:t>
+      </w:r>
+      <w:r>
+        <w:rPr>
+          <w:rFonts w:ascii="Arial" w:hAnsi="Arial" w:cs="Arial"/>
+          <w:sz w:val="24"/>
+          <w:szCs w:val="24"/>
+        </w:rPr>
+        <w:t xml:space="preserve"> this writing, </w:t>
+      </w:r>
       <w:proofErr w:type="gramStart"/>
       <w:r>
         <w:rPr>
@@ -12347,7 +12347,15 @@
           <w:sz w:val="24"/>
           <w:szCs w:val="24"/>
         </w:rPr>
-        <w:t>of</w:t>
+        <w:t xml:space="preserve">the </w:t>
+      </w:r>
+      <w:r>
+        <w:rPr>
+          <w:rFonts w:ascii="Arial" w:hAnsi="Arial" w:cs="Arial"/>
+          <w:sz w:val="24"/>
+          <w:szCs w:val="24"/>
+        </w:rPr>
+        <w:t>ULAS</w:t>
       </w:r>
       <w:proofErr w:type="gramEnd"/>
       <w:r>
@@ -12356,15 +12364,7 @@
           <w:sz w:val="24"/>
           <w:szCs w:val="24"/>
         </w:rPr>
-        <w:t xml:space="preserve"> this writing, the </w:t>
-      </w:r>
-      <w:r>
-        <w:rPr>
-          <w:rFonts w:ascii="Arial" w:hAnsi="Arial" w:cs="Arial"/>
-          <w:sz w:val="24"/>
-          <w:szCs w:val="24"/>
-        </w:rPr>
-        <w:t xml:space="preserve">ULAS </w:t>
+        <w:t xml:space="preserve"> </w:t>
       </w:r>
       <w:r>
         <w:rPr>
@@ -13697,13 +13697,15 @@
               <w:jc w:val="center"/>
               <w:rPr>
                 <w:rFonts w:ascii="Arial" w:hAnsi="Arial" w:cs="Arial"/>
-                <w:sz w:val="24"/>
-                <w:szCs w:val="24"/>
-              </w:rPr>
-            </w:pPr>
-            <w:r>
-              <w:rPr>
-                <w:rFonts w:ascii="Arial" w:hAnsi="Arial" w:cs="Arial"/>
+                <w:color w:val="EE0000"/>
+                <w:sz w:val="24"/>
+                <w:szCs w:val="24"/>
+              </w:rPr>
+            </w:pPr>
+            <w:r>
+              <w:rPr>
+                <w:rFonts w:ascii="Arial" w:hAnsi="Arial" w:cs="Arial"/>
+                <w:color w:val="EE0000"/>
                 <w:sz w:val="24"/>
                 <w:szCs w:val="24"/>
               </w:rPr>
@@ -13722,13 +13724,15 @@
               <w:jc w:val="center"/>
               <w:rPr>
                 <w:rFonts w:ascii="Arial" w:hAnsi="Arial" w:cs="Arial"/>
-                <w:sz w:val="24"/>
-                <w:szCs w:val="24"/>
-              </w:rPr>
-            </w:pPr>
-            <w:r>
-              <w:rPr>
-                <w:rFonts w:ascii="Arial" w:hAnsi="Arial" w:cs="Arial"/>
+                <w:color w:val="EE0000"/>
+                <w:sz w:val="24"/>
+                <w:szCs w:val="24"/>
+              </w:rPr>
+            </w:pPr>
+            <w:r>
+              <w:rPr>
+                <w:rFonts w:ascii="Arial" w:hAnsi="Arial" w:cs="Arial"/>
+                <w:color w:val="EE0000"/>
                 <w:sz w:val="24"/>
                 <w:szCs w:val="24"/>
               </w:rPr>
@@ -13747,13 +13751,15 @@
               <w:jc w:val="center"/>
               <w:rPr>
                 <w:rFonts w:ascii="Arial" w:hAnsi="Arial" w:cs="Arial"/>
-                <w:sz w:val="24"/>
-                <w:szCs w:val="24"/>
-              </w:rPr>
-            </w:pPr>
-            <w:r>
-              <w:rPr>
-                <w:rFonts w:ascii="Arial" w:hAnsi="Arial" w:cs="Arial"/>
+                <w:color w:val="EE0000"/>
+                <w:sz w:val="24"/>
+                <w:szCs w:val="24"/>
+              </w:rPr>
+            </w:pPr>
+            <w:r>
+              <w:rPr>
+                <w:rFonts w:ascii="Arial" w:hAnsi="Arial" w:cs="Arial"/>
+                <w:color w:val="EE0000"/>
                 <w:sz w:val="24"/>
                 <w:szCs w:val="24"/>
               </w:rPr>
@@ -13771,13 +13777,15 @@
             <w:pPr>
               <w:rPr>
                 <w:rFonts w:ascii="Arial" w:hAnsi="Arial" w:cs="Arial"/>
-                <w:sz w:val="24"/>
-                <w:szCs w:val="24"/>
-              </w:rPr>
-            </w:pPr>
-            <w:r>
-              <w:rPr>
-                <w:rFonts w:ascii="Arial" w:hAnsi="Arial" w:cs="Arial"/>
+                <w:color w:val="EE0000"/>
+                <w:sz w:val="24"/>
+                <w:szCs w:val="24"/>
+              </w:rPr>
+            </w:pPr>
+            <w:r>
+              <w:rPr>
+                <w:rFonts w:ascii="Arial" w:hAnsi="Arial" w:cs="Arial"/>
+                <w:color w:val="EE0000"/>
                 <w:sz w:val="24"/>
                 <w:szCs w:val="24"/>
               </w:rPr>
@@ -14530,13 +14538,15 @@
               <w:jc w:val="center"/>
               <w:rPr>
                 <w:rFonts w:ascii="Arial" w:hAnsi="Arial" w:cs="Arial"/>
-                <w:sz w:val="24"/>
-                <w:szCs w:val="24"/>
-              </w:rPr>
-            </w:pPr>
-            <w:r>
-              <w:rPr>
-                <w:rFonts w:ascii="Arial" w:hAnsi="Arial" w:cs="Arial"/>
+                <w:color w:val="EE0000"/>
+                <w:sz w:val="24"/>
+                <w:szCs w:val="24"/>
+              </w:rPr>
+            </w:pPr>
+            <w:r>
+              <w:rPr>
+                <w:rFonts w:ascii="Arial" w:hAnsi="Arial" w:cs="Arial"/>
+                <w:color w:val="EE0000"/>
                 <w:sz w:val="24"/>
                 <w:szCs w:val="24"/>
               </w:rPr>
@@ -14555,13 +14565,15 @@
               <w:jc w:val="center"/>
               <w:rPr>
                 <w:rFonts w:ascii="Arial" w:hAnsi="Arial" w:cs="Arial"/>
-                <w:sz w:val="24"/>
-                <w:szCs w:val="24"/>
-              </w:rPr>
-            </w:pPr>
-            <w:r>
-              <w:rPr>
-                <w:rFonts w:ascii="Arial" w:hAnsi="Arial" w:cs="Arial"/>
+                <w:color w:val="EE0000"/>
+                <w:sz w:val="24"/>
+                <w:szCs w:val="24"/>
+              </w:rPr>
+            </w:pPr>
+            <w:r>
+              <w:rPr>
+                <w:rFonts w:ascii="Arial" w:hAnsi="Arial" w:cs="Arial"/>
+                <w:color w:val="EE0000"/>
                 <w:sz w:val="24"/>
                 <w:szCs w:val="24"/>
               </w:rPr>
@@ -14580,13 +14592,15 @@
               <w:jc w:val="center"/>
               <w:rPr>
                 <w:rFonts w:ascii="Arial" w:hAnsi="Arial" w:cs="Arial"/>
-                <w:sz w:val="24"/>
-                <w:szCs w:val="24"/>
-              </w:rPr>
-            </w:pPr>
-            <w:r>
-              <w:rPr>
-                <w:rFonts w:ascii="Arial" w:hAnsi="Arial" w:cs="Arial"/>
+                <w:color w:val="EE0000"/>
+                <w:sz w:val="24"/>
+                <w:szCs w:val="24"/>
+              </w:rPr>
+            </w:pPr>
+            <w:r>
+              <w:rPr>
+                <w:rFonts w:ascii="Arial" w:hAnsi="Arial" w:cs="Arial"/>
+                <w:color w:val="EE0000"/>
                 <w:sz w:val="24"/>
                 <w:szCs w:val="24"/>
               </w:rPr>
@@ -14604,13 +14618,15 @@
             <w:pPr>
               <w:rPr>
                 <w:rFonts w:ascii="Arial" w:hAnsi="Arial" w:cs="Arial"/>
-                <w:sz w:val="24"/>
-                <w:szCs w:val="24"/>
-              </w:rPr>
-            </w:pPr>
-            <w:r>
-              <w:rPr>
-                <w:rFonts w:ascii="Arial" w:hAnsi="Arial" w:cs="Arial"/>
+                <w:color w:val="EE0000"/>
+                <w:sz w:val="24"/>
+                <w:szCs w:val="24"/>
+              </w:rPr>
+            </w:pPr>
+            <w:r>
+              <w:rPr>
+                <w:rFonts w:ascii="Arial" w:hAnsi="Arial" w:cs="Arial"/>
+                <w:color w:val="EE0000"/>
                 <w:sz w:val="24"/>
                 <w:szCs w:val="24"/>
               </w:rPr>
@@ -15363,13 +15379,15 @@
               <w:jc w:val="center"/>
               <w:rPr>
                 <w:rFonts w:ascii="Arial" w:hAnsi="Arial" w:cs="Arial"/>
-                <w:sz w:val="24"/>
-                <w:szCs w:val="24"/>
-              </w:rPr>
-            </w:pPr>
-            <w:r>
-              <w:rPr>
-                <w:rFonts w:ascii="Arial" w:hAnsi="Arial" w:cs="Arial"/>
+                <w:color w:val="EE0000"/>
+                <w:sz w:val="24"/>
+                <w:szCs w:val="24"/>
+              </w:rPr>
+            </w:pPr>
+            <w:r>
+              <w:rPr>
+                <w:rFonts w:ascii="Arial" w:hAnsi="Arial" w:cs="Arial"/>
+                <w:color w:val="EE0000"/>
                 <w:sz w:val="24"/>
                 <w:szCs w:val="24"/>
               </w:rPr>
@@ -15388,13 +15406,15 @@
               <w:jc w:val="center"/>
               <w:rPr>
                 <w:rFonts w:ascii="Arial" w:hAnsi="Arial" w:cs="Arial"/>
-                <w:sz w:val="24"/>
-                <w:szCs w:val="24"/>
-              </w:rPr>
-            </w:pPr>
-            <w:r>
-              <w:rPr>
-                <w:rFonts w:ascii="Arial" w:hAnsi="Arial" w:cs="Arial"/>
+                <w:color w:val="EE0000"/>
+                <w:sz w:val="24"/>
+                <w:szCs w:val="24"/>
+              </w:rPr>
+            </w:pPr>
+            <w:r>
+              <w:rPr>
+                <w:rFonts w:ascii="Arial" w:hAnsi="Arial" w:cs="Arial"/>
+                <w:color w:val="EE0000"/>
                 <w:sz w:val="24"/>
                 <w:szCs w:val="24"/>
               </w:rPr>
@@ -15413,13 +15433,15 @@
               <w:jc w:val="center"/>
               <w:rPr>
                 <w:rFonts w:ascii="Arial" w:hAnsi="Arial" w:cs="Arial"/>
-                <w:sz w:val="24"/>
-                <w:szCs w:val="24"/>
-              </w:rPr>
-            </w:pPr>
-            <w:r>
-              <w:rPr>
-                <w:rFonts w:ascii="Arial" w:hAnsi="Arial" w:cs="Arial"/>
+                <w:color w:val="EE0000"/>
+                <w:sz w:val="24"/>
+                <w:szCs w:val="24"/>
+              </w:rPr>
+            </w:pPr>
+            <w:r>
+              <w:rPr>
+                <w:rFonts w:ascii="Arial" w:hAnsi="Arial" w:cs="Arial"/>
+                <w:color w:val="EE0000"/>
                 <w:sz w:val="24"/>
                 <w:szCs w:val="24"/>
               </w:rPr>
@@ -15437,13 +15459,15 @@
             <w:pPr>
               <w:rPr>
                 <w:rFonts w:ascii="Arial" w:hAnsi="Arial" w:cs="Arial"/>
-                <w:sz w:val="24"/>
-                <w:szCs w:val="24"/>
-              </w:rPr>
-            </w:pPr>
-            <w:r>
-              <w:rPr>
-                <w:rFonts w:ascii="Arial" w:hAnsi="Arial" w:cs="Arial"/>
+                <w:color w:val="EE0000"/>
+                <w:sz w:val="24"/>
+                <w:szCs w:val="24"/>
+              </w:rPr>
+            </w:pPr>
+            <w:r>
+              <w:rPr>
+                <w:rFonts w:ascii="Arial" w:hAnsi="Arial" w:cs="Arial"/>
+                <w:color w:val="EE0000"/>
                 <w:sz w:val="24"/>
                 <w:szCs w:val="24"/>
               </w:rPr>
@@ -15655,7 +15679,7 @@
                 <w:sz w:val="24"/>
                 <w:szCs w:val="24"/>
               </w:rPr>
-              <w:t>As a Qualified Beneficiary, I want to update login credentials or information so that my account remains secure and contactable.</w:t>
+              <w:t>As a Qualified Beneficiary, I want to update information so that my account remains secure and contactable.</w:t>
             </w:r>
           </w:p>
         </w:tc>
@@ -15987,13 +16011,15 @@
               <w:jc w:val="center"/>
               <w:rPr>
                 <w:rFonts w:ascii="Arial" w:hAnsi="Arial" w:cs="Arial"/>
-                <w:sz w:val="24"/>
-                <w:szCs w:val="24"/>
-              </w:rPr>
-            </w:pPr>
-            <w:r>
-              <w:rPr>
-                <w:rFonts w:ascii="Arial" w:hAnsi="Arial" w:cs="Arial"/>
+                <w:color w:val="EE0000"/>
+                <w:sz w:val="24"/>
+                <w:szCs w:val="24"/>
+              </w:rPr>
+            </w:pPr>
+            <w:r>
+              <w:rPr>
+                <w:rFonts w:ascii="Arial" w:hAnsi="Arial" w:cs="Arial"/>
+                <w:color w:val="EE0000"/>
                 <w:sz w:val="24"/>
                 <w:szCs w:val="24"/>
               </w:rPr>
@@ -16012,13 +16038,15 @@
               <w:jc w:val="center"/>
               <w:rPr>
                 <w:rFonts w:ascii="Arial" w:hAnsi="Arial" w:cs="Arial"/>
-                <w:sz w:val="24"/>
-                <w:szCs w:val="24"/>
-              </w:rPr>
-            </w:pPr>
-            <w:r>
-              <w:rPr>
-                <w:rFonts w:ascii="Arial" w:hAnsi="Arial" w:cs="Arial"/>
+                <w:color w:val="EE0000"/>
+                <w:sz w:val="24"/>
+                <w:szCs w:val="24"/>
+              </w:rPr>
+            </w:pPr>
+            <w:r>
+              <w:rPr>
+                <w:rFonts w:ascii="Arial" w:hAnsi="Arial" w:cs="Arial"/>
+                <w:color w:val="EE0000"/>
                 <w:sz w:val="24"/>
                 <w:szCs w:val="24"/>
               </w:rPr>
@@ -16037,13 +16065,15 @@
               <w:jc w:val="center"/>
               <w:rPr>
                 <w:rFonts w:ascii="Arial" w:hAnsi="Arial" w:cs="Arial"/>
-                <w:sz w:val="24"/>
-                <w:szCs w:val="24"/>
-              </w:rPr>
-            </w:pPr>
-            <w:r>
-              <w:rPr>
-                <w:rFonts w:ascii="Arial" w:hAnsi="Arial" w:cs="Arial"/>
+                <w:color w:val="EE0000"/>
+                <w:sz w:val="24"/>
+                <w:szCs w:val="24"/>
+              </w:rPr>
+            </w:pPr>
+            <w:r>
+              <w:rPr>
+                <w:rFonts w:ascii="Arial" w:hAnsi="Arial" w:cs="Arial"/>
+                <w:color w:val="EE0000"/>
                 <w:sz w:val="24"/>
                 <w:szCs w:val="24"/>
               </w:rPr>
@@ -16061,13 +16091,15 @@
             <w:pPr>
               <w:rPr>
                 <w:rFonts w:ascii="Arial" w:hAnsi="Arial" w:cs="Arial"/>
-                <w:sz w:val="24"/>
-                <w:szCs w:val="24"/>
-              </w:rPr>
-            </w:pPr>
-            <w:r>
-              <w:rPr>
-                <w:rFonts w:ascii="Arial" w:hAnsi="Arial" w:cs="Arial"/>
+                <w:color w:val="EE0000"/>
+                <w:sz w:val="24"/>
+                <w:szCs w:val="24"/>
+              </w:rPr>
+            </w:pPr>
+            <w:r>
+              <w:rPr>
+                <w:rFonts w:ascii="Arial" w:hAnsi="Arial" w:cs="Arial"/>
+                <w:color w:val="EE0000"/>
                 <w:sz w:val="24"/>
                 <w:szCs w:val="24"/>
               </w:rPr>
@@ -16359,16 +16391,7 @@
                 <w:sz w:val="24"/>
                 <w:szCs w:val="24"/>
               </w:rPr>
-              <w:t xml:space="preserve">Covered Lawyer-Qualified </w:t>
-            </w:r>
-            <w:r>
-              <w:rPr>
-                <w:rFonts w:ascii="Arial" w:hAnsi="Arial" w:cs="Arial"/>
-                <w:sz w:val="24"/>
-                <w:szCs w:val="24"/>
-              </w:rPr>
-              <w:lastRenderedPageBreak/>
-              <w:t>Beneficiary Collaboration</w:t>
+              <w:t>Covered Lawyer-Qualified Beneficiary Collaboration</w:t>
             </w:r>
           </w:p>
         </w:tc>
@@ -16392,7 +16415,6 @@
                 <w:sz w:val="24"/>
                 <w:szCs w:val="24"/>
               </w:rPr>
-              <w:lastRenderedPageBreak/>
               <w:t xml:space="preserve">As a Qualified Beneficiary, I want to view my case details, </w:t>
             </w:r>
             <w:proofErr w:type="gramStart"/>
@@ -16441,6 +16463,7 @@
                 <w:sz w:val="24"/>
                 <w:szCs w:val="24"/>
               </w:rPr>
+              <w:lastRenderedPageBreak/>
               <w:t>32</w:t>
             </w:r>
           </w:p>
@@ -16951,13 +16974,15 @@
               <w:jc w:val="center"/>
               <w:rPr>
                 <w:rFonts w:ascii="Arial" w:hAnsi="Arial" w:cs="Arial"/>
-                <w:sz w:val="24"/>
-                <w:szCs w:val="24"/>
-              </w:rPr>
-            </w:pPr>
-            <w:r>
-              <w:rPr>
-                <w:rFonts w:ascii="Arial" w:hAnsi="Arial" w:cs="Arial"/>
+                <w:color w:val="EE0000"/>
+                <w:sz w:val="24"/>
+                <w:szCs w:val="24"/>
+              </w:rPr>
+            </w:pPr>
+            <w:r>
+              <w:rPr>
+                <w:rFonts w:ascii="Arial" w:hAnsi="Arial" w:cs="Arial"/>
+                <w:color w:val="EE0000"/>
                 <w:sz w:val="24"/>
                 <w:szCs w:val="24"/>
               </w:rPr>
@@ -16976,13 +17001,15 @@
               <w:jc w:val="center"/>
               <w:rPr>
                 <w:rFonts w:ascii="Arial" w:hAnsi="Arial" w:cs="Arial"/>
-                <w:sz w:val="24"/>
-                <w:szCs w:val="24"/>
-              </w:rPr>
-            </w:pPr>
-            <w:r>
-              <w:rPr>
-                <w:rFonts w:ascii="Arial" w:hAnsi="Arial" w:cs="Arial"/>
+                <w:color w:val="EE0000"/>
+                <w:sz w:val="24"/>
+                <w:szCs w:val="24"/>
+              </w:rPr>
+            </w:pPr>
+            <w:r>
+              <w:rPr>
+                <w:rFonts w:ascii="Arial" w:hAnsi="Arial" w:cs="Arial"/>
+                <w:color w:val="EE0000"/>
                 <w:sz w:val="24"/>
                 <w:szCs w:val="24"/>
               </w:rPr>
@@ -17001,13 +17028,15 @@
               <w:jc w:val="center"/>
               <w:rPr>
                 <w:rFonts w:ascii="Arial" w:hAnsi="Arial" w:cs="Arial"/>
-                <w:sz w:val="24"/>
-                <w:szCs w:val="24"/>
-              </w:rPr>
-            </w:pPr>
-            <w:r>
-              <w:rPr>
-                <w:rFonts w:ascii="Arial" w:hAnsi="Arial" w:cs="Arial"/>
+                <w:color w:val="EE0000"/>
+                <w:sz w:val="24"/>
+                <w:szCs w:val="24"/>
+              </w:rPr>
+            </w:pPr>
+            <w:r>
+              <w:rPr>
+                <w:rFonts w:ascii="Arial" w:hAnsi="Arial" w:cs="Arial"/>
+                <w:color w:val="EE0000"/>
                 <w:sz w:val="24"/>
                 <w:szCs w:val="24"/>
               </w:rPr>
@@ -17025,13 +17054,15 @@
             <w:pPr>
               <w:rPr>
                 <w:rFonts w:ascii="Arial" w:hAnsi="Arial" w:cs="Arial"/>
-                <w:sz w:val="24"/>
-                <w:szCs w:val="24"/>
-              </w:rPr>
-            </w:pPr>
-            <w:r>
-              <w:rPr>
-                <w:rFonts w:ascii="Arial" w:hAnsi="Arial" w:cs="Arial"/>
+                <w:color w:val="EE0000"/>
+                <w:sz w:val="24"/>
+                <w:szCs w:val="24"/>
+              </w:rPr>
+            </w:pPr>
+            <w:r>
+              <w:rPr>
+                <w:rFonts w:ascii="Arial" w:hAnsi="Arial" w:cs="Arial"/>
+                <w:color w:val="EE0000"/>
                 <w:sz w:val="24"/>
                 <w:szCs w:val="24"/>
               </w:rPr>
@@ -17055,13 +17086,15 @@
               <w:jc w:val="center"/>
               <w:rPr>
                 <w:rFonts w:ascii="Arial" w:hAnsi="Arial" w:cs="Arial"/>
-                <w:sz w:val="24"/>
-                <w:szCs w:val="24"/>
-              </w:rPr>
-            </w:pPr>
-            <w:r>
-              <w:rPr>
-                <w:rFonts w:ascii="Arial" w:hAnsi="Arial" w:cs="Arial"/>
+                <w:color w:val="EE0000"/>
+                <w:sz w:val="24"/>
+                <w:szCs w:val="24"/>
+              </w:rPr>
+            </w:pPr>
+            <w:r>
+              <w:rPr>
+                <w:rFonts w:ascii="Arial" w:hAnsi="Arial" w:cs="Arial"/>
+                <w:color w:val="EE0000"/>
                 <w:sz w:val="24"/>
                 <w:szCs w:val="24"/>
               </w:rPr>
@@ -17080,13 +17113,15 @@
               <w:jc w:val="center"/>
               <w:rPr>
                 <w:rFonts w:ascii="Arial" w:hAnsi="Arial" w:cs="Arial"/>
-                <w:sz w:val="24"/>
-                <w:szCs w:val="24"/>
-              </w:rPr>
-            </w:pPr>
-            <w:r>
-              <w:rPr>
-                <w:rFonts w:ascii="Arial" w:hAnsi="Arial" w:cs="Arial"/>
+                <w:color w:val="EE0000"/>
+                <w:sz w:val="24"/>
+                <w:szCs w:val="24"/>
+              </w:rPr>
+            </w:pPr>
+            <w:r>
+              <w:rPr>
+                <w:rFonts w:ascii="Arial" w:hAnsi="Arial" w:cs="Arial"/>
+                <w:color w:val="EE0000"/>
                 <w:sz w:val="24"/>
                 <w:szCs w:val="24"/>
               </w:rPr>
@@ -17105,13 +17140,15 @@
               <w:jc w:val="center"/>
               <w:rPr>
                 <w:rFonts w:ascii="Arial" w:hAnsi="Arial" w:cs="Arial"/>
-                <w:sz w:val="24"/>
-                <w:szCs w:val="24"/>
-              </w:rPr>
-            </w:pPr>
-            <w:r>
-              <w:rPr>
-                <w:rFonts w:ascii="Arial" w:hAnsi="Arial" w:cs="Arial"/>
+                <w:color w:val="EE0000"/>
+                <w:sz w:val="24"/>
+                <w:szCs w:val="24"/>
+              </w:rPr>
+            </w:pPr>
+            <w:r>
+              <w:rPr>
+                <w:rFonts w:ascii="Arial" w:hAnsi="Arial" w:cs="Arial"/>
+                <w:color w:val="EE0000"/>
                 <w:sz w:val="24"/>
                 <w:szCs w:val="24"/>
               </w:rPr>
@@ -17129,13 +17166,15 @@
             <w:pPr>
               <w:rPr>
                 <w:rFonts w:ascii="Arial" w:hAnsi="Arial" w:cs="Arial"/>
-                <w:sz w:val="24"/>
-                <w:szCs w:val="24"/>
-              </w:rPr>
-            </w:pPr>
-            <w:r>
-              <w:rPr>
-                <w:rFonts w:ascii="Arial" w:hAnsi="Arial" w:cs="Arial"/>
+                <w:color w:val="EE0000"/>
+                <w:sz w:val="24"/>
+                <w:szCs w:val="24"/>
+              </w:rPr>
+            </w:pPr>
+            <w:r>
+              <w:rPr>
+                <w:rFonts w:ascii="Arial" w:hAnsi="Arial" w:cs="Arial"/>
+                <w:color w:val="EE0000"/>
                 <w:sz w:val="24"/>
                 <w:szCs w:val="24"/>
               </w:rPr>
@@ -17323,16 +17362,7 @@
                 <w:sz w:val="24"/>
                 <w:szCs w:val="24"/>
               </w:rPr>
-              <w:t xml:space="preserve">Covered Lawyer-Qualified </w:t>
-            </w:r>
-            <w:r>
-              <w:rPr>
-                <w:rFonts w:ascii="Arial" w:hAnsi="Arial" w:cs="Arial"/>
-                <w:sz w:val="24"/>
-                <w:szCs w:val="24"/>
-              </w:rPr>
-              <w:lastRenderedPageBreak/>
-              <w:t>Beneficiary Collaboration</w:t>
+              <w:t>Covered Lawyer-Qualified Beneficiary Collaboration</w:t>
             </w:r>
           </w:p>
         </w:tc>
@@ -17356,7 +17386,6 @@
                 <w:sz w:val="24"/>
                 <w:szCs w:val="24"/>
               </w:rPr>
-              <w:lastRenderedPageBreak/>
               <w:t>As a Qualified Beneficiary, I want to view my terminated cases in read-only mode so that I can still reference past case information even though the case was closed due to falsified details</w:t>
             </w:r>
           </w:p>
@@ -17387,6 +17416,7 @@
                 <w:sz w:val="24"/>
                 <w:szCs w:val="24"/>
               </w:rPr>
+              <w:lastRenderedPageBreak/>
               <w:t>41</w:t>
             </w:r>
           </w:p>
@@ -17461,7 +17491,7 @@
                 <w:sz w:val="24"/>
                 <w:szCs w:val="24"/>
               </w:rPr>
-              <w:t>As a Qualified Beneficiary, I want to access my active cases with a different lawyer using my existing account so that all my cases are in one place</w:t>
+              <w:t>As a Qualified Beneficiary, I want to access my active cases using my existing account so that all my cases are in one place</w:t>
             </w:r>
           </w:p>
         </w:tc>
@@ -17565,7 +17595,23 @@
                 <w:sz w:val="24"/>
                 <w:szCs w:val="24"/>
               </w:rPr>
-              <w:t>As a Covered Lawyer, I want to create a service entry linked to a case by recording required details such as category, nature of service, hours, description, and proof so that my work is properly documented.</w:t>
+              <w:t>As a Covered Lawyer, I want to create a service entry linked to a case by recording required details such as category, nature of service, hours,</w:t>
+            </w:r>
+            <w:r>
+              <w:rPr>
+                <w:rFonts w:ascii="Arial" w:hAnsi="Arial" w:cs="Arial"/>
+                <w:sz w:val="24"/>
+                <w:szCs w:val="24"/>
+              </w:rPr>
+              <w:t xml:space="preserve"> and</w:t>
+            </w:r>
+            <w:r>
+              <w:rPr>
+                <w:rFonts w:ascii="Arial" w:hAnsi="Arial" w:cs="Arial"/>
+                <w:sz w:val="24"/>
+                <w:szCs w:val="24"/>
+              </w:rPr>
+              <w:t xml:space="preserve"> description so that my work is properly documented.</w:t>
             </w:r>
           </w:p>
         </w:tc>
@@ -17669,7 +17715,41 @@
                 <w:sz w:val="24"/>
                 <w:szCs w:val="24"/>
               </w:rPr>
-              <w:t>As a Covered Lawyer, I want to manage service entry drafting, editing, finalizing, and deleting so that my records remain accurate and complete.</w:t>
+              <w:t xml:space="preserve">As a Covered Lawyer, I want to manage service entry </w:t>
+            </w:r>
+            <w:proofErr w:type="gramStart"/>
+            <w:r>
+              <w:rPr>
+                <w:rFonts w:ascii="Arial" w:hAnsi="Arial" w:cs="Arial"/>
+                <w:sz w:val="24"/>
+                <w:szCs w:val="24"/>
+              </w:rPr>
+              <w:t xml:space="preserve">drafting, </w:t>
+            </w:r>
+            <w:r>
+              <w:rPr>
+                <w:rFonts w:ascii="Arial" w:hAnsi="Arial" w:cs="Arial"/>
+                <w:sz w:val="24"/>
+                <w:szCs w:val="24"/>
+              </w:rPr>
+              <w:t>and</w:t>
+            </w:r>
+            <w:proofErr w:type="gramEnd"/>
+            <w:r>
+              <w:rPr>
+                <w:rFonts w:ascii="Arial" w:hAnsi="Arial" w:cs="Arial"/>
+                <w:sz w:val="24"/>
+                <w:szCs w:val="24"/>
+              </w:rPr>
+              <w:t xml:space="preserve"> </w:t>
+            </w:r>
+            <w:r>
+              <w:rPr>
+                <w:rFonts w:ascii="Arial" w:hAnsi="Arial" w:cs="Arial"/>
+                <w:sz w:val="24"/>
+                <w:szCs w:val="24"/>
+              </w:rPr>
+              <w:t>finalizing so that my records remain accurate and complete.</w:t>
             </w:r>
           </w:p>
         </w:tc>
@@ -18189,7 +18269,23 @@
                 <w:sz w:val="24"/>
                 <w:szCs w:val="24"/>
               </w:rPr>
-              <w:t>As a Covered Lawyer, I want to mark a service entry as complete so that it is marked as ready for inclusion in compliance reporting and submission to the ULAS Portal.</w:t>
+              <w:t xml:space="preserve">As a Covered Lawyer, I want to mark a service entry as </w:t>
+            </w:r>
+            <w:r>
+              <w:rPr>
+                <w:rFonts w:ascii="Arial" w:hAnsi="Arial" w:cs="Arial"/>
+                <w:sz w:val="24"/>
+                <w:szCs w:val="24"/>
+              </w:rPr>
+              <w:t>finalized</w:t>
+            </w:r>
+            <w:r>
+              <w:rPr>
+                <w:rFonts w:ascii="Arial" w:hAnsi="Arial" w:cs="Arial"/>
+                <w:sz w:val="24"/>
+                <w:szCs w:val="24"/>
+              </w:rPr>
+              <w:t xml:space="preserve"> so that it is marked as ready for inclusion in compliance reporting and submission to the ULAS Portal.</w:t>
             </w:r>
           </w:p>
         </w:tc>
@@ -18501,7 +18597,23 @@
                 <w:sz w:val="24"/>
                 <w:szCs w:val="24"/>
               </w:rPr>
-              <w:t>As a Covered Lawyer, I want service entries to have a status (draft, submitted) so that I can manage compliance preparation.</w:t>
+              <w:t xml:space="preserve">As a Covered Lawyer, I want service entries to have a status (draft, </w:t>
+            </w:r>
+            <w:r>
+              <w:rPr>
+                <w:rFonts w:ascii="Arial" w:hAnsi="Arial" w:cs="Arial"/>
+                <w:sz w:val="24"/>
+                <w:szCs w:val="24"/>
+              </w:rPr>
+              <w:t>finaliz</w:t>
+            </w:r>
+            <w:r>
+              <w:rPr>
+                <w:rFonts w:ascii="Arial" w:hAnsi="Arial" w:cs="Arial"/>
+                <w:sz w:val="24"/>
+                <w:szCs w:val="24"/>
+              </w:rPr>
+              <w:t>ed) so that I can manage compliance preparation.</w:t>
             </w:r>
           </w:p>
         </w:tc>
@@ -18635,7 +18747,6 @@
                 <w:sz w:val="24"/>
                 <w:szCs w:val="24"/>
               </w:rPr>
-              <w:lastRenderedPageBreak/>
               <w:t>53</w:t>
             </w:r>
           </w:p>
@@ -18710,7 +18821,16 @@
                 <w:sz w:val="24"/>
                 <w:szCs w:val="24"/>
               </w:rPr>
-              <w:t>As a Covered Lawyer, I want to see the remaining number of required hours for the current compliance period so that I can plan my pro bono commitments accordingly.</w:t>
+              <w:t xml:space="preserve">As a Covered Lawyer, I want to see the remaining number of required hours for the current compliance </w:t>
+            </w:r>
+            <w:r>
+              <w:rPr>
+                <w:rFonts w:ascii="Arial" w:hAnsi="Arial" w:cs="Arial"/>
+                <w:sz w:val="24"/>
+                <w:szCs w:val="24"/>
+              </w:rPr>
+              <w:lastRenderedPageBreak/>
+              <w:t>period so that I can plan my pro bono commitments accordingly.</w:t>
             </w:r>
           </w:p>
         </w:tc>
@@ -18730,16 +18850,19 @@
               <w:jc w:val="center"/>
               <w:rPr>
                 <w:rFonts w:ascii="Arial" w:hAnsi="Arial" w:cs="Arial"/>
-                <w:sz w:val="24"/>
-                <w:szCs w:val="24"/>
-              </w:rPr>
-            </w:pPr>
-            <w:r>
-              <w:rPr>
-                <w:rFonts w:ascii="Arial" w:hAnsi="Arial" w:cs="Arial"/>
-                <w:sz w:val="24"/>
-                <w:szCs w:val="24"/>
-              </w:rPr>
+                <w:color w:val="EE0000"/>
+                <w:sz w:val="24"/>
+                <w:szCs w:val="24"/>
+              </w:rPr>
+            </w:pPr>
+            <w:r>
+              <w:rPr>
+                <w:rFonts w:ascii="Arial" w:hAnsi="Arial" w:cs="Arial"/>
+                <w:color w:val="EE0000"/>
+                <w:sz w:val="24"/>
+                <w:szCs w:val="24"/>
+              </w:rPr>
+              <w:lastRenderedPageBreak/>
               <w:t>54</w:t>
             </w:r>
           </w:p>
@@ -18755,13 +18878,15 @@
               <w:jc w:val="center"/>
               <w:rPr>
                 <w:rFonts w:ascii="Arial" w:hAnsi="Arial" w:cs="Arial"/>
-                <w:sz w:val="24"/>
-                <w:szCs w:val="24"/>
-              </w:rPr>
-            </w:pPr>
-            <w:r>
-              <w:rPr>
-                <w:rFonts w:ascii="Arial" w:hAnsi="Arial" w:cs="Arial"/>
+                <w:color w:val="EE0000"/>
+                <w:sz w:val="24"/>
+                <w:szCs w:val="24"/>
+              </w:rPr>
+            </w:pPr>
+            <w:r>
+              <w:rPr>
+                <w:rFonts w:ascii="Arial" w:hAnsi="Arial" w:cs="Arial"/>
+                <w:color w:val="EE0000"/>
                 <w:sz w:val="24"/>
                 <w:szCs w:val="24"/>
               </w:rPr>
@@ -18780,13 +18905,15 @@
               <w:jc w:val="center"/>
               <w:rPr>
                 <w:rFonts w:ascii="Arial" w:hAnsi="Arial" w:cs="Arial"/>
-                <w:sz w:val="24"/>
-                <w:szCs w:val="24"/>
-              </w:rPr>
-            </w:pPr>
-            <w:r>
-              <w:rPr>
-                <w:rFonts w:ascii="Arial" w:hAnsi="Arial" w:cs="Arial"/>
+                <w:color w:val="EE0000"/>
+                <w:sz w:val="24"/>
+                <w:szCs w:val="24"/>
+              </w:rPr>
+            </w:pPr>
+            <w:r>
+              <w:rPr>
+                <w:rFonts w:ascii="Arial" w:hAnsi="Arial" w:cs="Arial"/>
+                <w:color w:val="EE0000"/>
                 <w:sz w:val="24"/>
                 <w:szCs w:val="24"/>
               </w:rPr>
@@ -18804,13 +18931,15 @@
             <w:pPr>
               <w:rPr>
                 <w:rFonts w:ascii="Arial" w:hAnsi="Arial" w:cs="Arial"/>
-                <w:sz w:val="24"/>
-                <w:szCs w:val="24"/>
-              </w:rPr>
-            </w:pPr>
-            <w:r>
-              <w:rPr>
-                <w:rFonts w:ascii="Arial" w:hAnsi="Arial" w:cs="Arial"/>
+                <w:color w:val="EE0000"/>
+                <w:sz w:val="24"/>
+                <w:szCs w:val="24"/>
+              </w:rPr>
+            </w:pPr>
+            <w:r>
+              <w:rPr>
+                <w:rFonts w:ascii="Arial" w:hAnsi="Arial" w:cs="Arial"/>
+                <w:color w:val="EE0000"/>
                 <w:sz w:val="24"/>
                 <w:szCs w:val="24"/>
               </w:rPr>
@@ -19181,6 +19310,7 @@
           <w:sz w:val="24"/>
           <w:szCs w:val="24"/>
         </w:rPr>
+        <w:lastRenderedPageBreak/>
         <w:t xml:space="preserve">The following tables provide detailed descriptions of each use case, outlining the interactions between users and the system to fulfill requirements. </w:t>
       </w:r>
     </w:p>
@@ -19894,7 +20024,6 @@
                 <w:sz w:val="24"/>
                 <w:szCs w:val="24"/>
               </w:rPr>
-              <w:lastRenderedPageBreak/>
               <w:t>Cases in Pending Transfer or Active status are accessible only to the assigned lawyer; sending lawyer can view in read-only mode during transfer</w:t>
             </w:r>
           </w:p>
@@ -19919,6 +20048,7 @@
                 <w:sz w:val="24"/>
                 <w:szCs w:val="24"/>
               </w:rPr>
+              <w:lastRenderedPageBreak/>
               <w:t>Transferred cases retain service entry credit for the sending lawyer and are visible to the receiving lawyer only after certificate validation.</w:t>
             </w:r>
           </w:p>
@@ -20822,7 +20952,6 @@
                 <w:sz w:val="24"/>
                 <w:szCs w:val="24"/>
               </w:rPr>
-              <w:lastRenderedPageBreak/>
               <w:t>[</w:t>
             </w:r>
             <w:r>
@@ -20900,6 +21029,7 @@
           <w:sz w:val="24"/>
           <w:szCs w:val="24"/>
         </w:rPr>
+        <w:lastRenderedPageBreak/>
         <w:t xml:space="preserve">Table </w:t>
       </w:r>
       <w:r>
@@ -21593,16 +21723,14 @@
               </w:rPr>
               <w:t xml:space="preserve">Covered Lawyer profile information from portal </w:t>
             </w:r>
-            <w:proofErr w:type="gramStart"/>
-            <w:r>
-              <w:rPr>
-                <w:rFonts w:ascii="Arial" w:hAnsi="Arial" w:cs="Arial"/>
-                <w:sz w:val="24"/>
-                <w:szCs w:val="24"/>
-              </w:rPr>
-              <w:t>are</w:t>
-            </w:r>
-            <w:proofErr w:type="gramEnd"/>
+            <w:r>
+              <w:rPr>
+                <w:rFonts w:ascii="Arial" w:hAnsi="Arial" w:cs="Arial"/>
+                <w:sz w:val="24"/>
+                <w:szCs w:val="24"/>
+              </w:rPr>
+              <w:t>is</w:t>
+            </w:r>
             <w:r>
               <w:rPr>
                 <w:rFonts w:ascii="Arial" w:hAnsi="Arial" w:cs="Arial"/>
@@ -21657,7 +21785,6 @@
                 <w:sz w:val="24"/>
                 <w:szCs w:val="24"/>
               </w:rPr>
-              <w:lastRenderedPageBreak/>
               <w:t>Existing Qualified Beneficiary accounts are reused when linked to new cases.</w:t>
             </w:r>
           </w:p>
@@ -21682,7 +21809,23 @@
                 <w:sz w:val="24"/>
                 <w:szCs w:val="24"/>
               </w:rPr>
-              <w:t>Any changes to login credentials or contact details are saved</w:t>
+              <w:t xml:space="preserve">Any changes to </w:t>
+            </w:r>
+            <w:r>
+              <w:rPr>
+                <w:rFonts w:ascii="Arial" w:hAnsi="Arial" w:cs="Arial"/>
+                <w:sz w:val="24"/>
+                <w:szCs w:val="24"/>
+              </w:rPr>
+              <w:t>personal</w:t>
+            </w:r>
+            <w:r>
+              <w:rPr>
+                <w:rFonts w:ascii="Arial" w:hAnsi="Arial" w:cs="Arial"/>
+                <w:sz w:val="24"/>
+                <w:szCs w:val="24"/>
+              </w:rPr>
+              <w:t xml:space="preserve"> details are saved</w:t>
             </w:r>
           </w:p>
         </w:tc>
@@ -21712,7 +21855,6 @@
                 <w:sz w:val="24"/>
                 <w:szCs w:val="24"/>
               </w:rPr>
-              <w:lastRenderedPageBreak/>
               <w:t>Flow of Activities:</w:t>
             </w:r>
           </w:p>
@@ -24931,7 +25073,23 @@
                 <w:sz w:val="24"/>
                 <w:szCs w:val="24"/>
               </w:rPr>
-              <w:t>This use case allows Covered Lawyers to record, manage, and track legal services rendered for assigned cases in ULAS Easy Justice. Lawyers can create service entries by recording required details such as category, nature of service, hours rendered, description, and supporting proof. Service entries can be saved as drafts, finalized, submitted for portal reporting, and linked to compliance tracking. All service hours remain credited to the lawyer even when cases are transferred or terminated, and finalized entries are prepared for export to the ULAS Portal for compliance reporting.</w:t>
+              <w:t xml:space="preserve">This use case allows Covered Lawyers to record, manage, and track legal services rendered for assigned cases in ULAS Easy Justice. Lawyers can create service entries by recording required details such as category, nature of service, hours rendered, </w:t>
+            </w:r>
+            <w:r>
+              <w:rPr>
+                <w:rFonts w:ascii="Arial" w:hAnsi="Arial" w:cs="Arial"/>
+                <w:sz w:val="24"/>
+                <w:szCs w:val="24"/>
+              </w:rPr>
+              <w:t xml:space="preserve">and </w:t>
+            </w:r>
+            <w:r>
+              <w:rPr>
+                <w:rFonts w:ascii="Arial" w:hAnsi="Arial" w:cs="Arial"/>
+                <w:sz w:val="24"/>
+                <w:szCs w:val="24"/>
+              </w:rPr>
+              <w:t>description. Service entries can be saved as drafts, finalized, submitted for portal reporting, and linked to compliance tracking. All service hours remain credited to the lawyer even when cases are transferred or terminated, and finalized entries are prepared for export to the ULAS Portal for compliance reporting.</w:t>
             </w:r>
           </w:p>
         </w:tc>
@@ -28427,7 +28585,7 @@
           <w:szCs w:val="24"/>
         </w:rPr>
         <w:drawing>
-          <wp:inline distT="0" distB="0" distL="0" distR="0" wp14:anchorId="69575B5B" wp14:editId="4E8870C3">
+          <wp:inline distT="0" distB="0" distL="0" distR="0" wp14:anchorId="69575B5B" wp14:editId="704AEC59">
             <wp:extent cx="5943600" cy="4128135"/>
             <wp:effectExtent l="0" t="0" r="0" b="5715"/>
             <wp:docPr id="1538797192" name="Picture 4"/>
@@ -34797,7 +34955,7 @@
                 <w:szCs w:val="24"/>
               </w:rPr>
               <w:drawing>
-                <wp:anchor distT="0" distB="0" distL="114300" distR="114300" simplePos="0" relativeHeight="487549440" behindDoc="0" locked="0" layoutInCell="1" allowOverlap="1" wp14:anchorId="65D72B2B" wp14:editId="15F40C4C">
+                <wp:anchor distT="0" distB="0" distL="114300" distR="114300" simplePos="0" relativeHeight="487549440" behindDoc="0" locked="0" layoutInCell="1" allowOverlap="1" wp14:anchorId="65D72B2B" wp14:editId="27FB5725">
                   <wp:simplePos x="0" y="0"/>
                   <wp:positionH relativeFrom="margin">
                     <wp:posOffset>-22860</wp:posOffset>

</xml_diff>